<commit_message>
Expand Slovenian technical documentation
</commit_message>
<xml_diff>
--- a/logging/InforiaConnect_Tehnicni_Pregled.docx
+++ b/logging/InforiaConnect_Tehnicni_Pregled.docx
@@ -2178,6 +2178,294 @@
       </w:r>
     </w:p>
     <w:p/>
+    <w:p>
+      <w:r>
+        <w:br w:type="page"/>
+      </w:r>
+    </w:p>
+    <w:p>
+      <w:pPr>
+        <w:pStyle w:val="Heading1"/>
+      </w:pPr>
+      <w:r>
+        <w:t xml:space="preserve">14. Nadzor dokumenta in obseg</w:t>
+      </w:r>
+    </w:p>
+    <w:p>
+      <w:r>
+        <w:t xml:space="preserve">Lastnik: Inforia d.o.o. / sistemska administracija | Interno | Različica 1.1 | 6. 6. 2026</w:t>
+      </w:r>
+    </w:p>
+    <w:p>
+      <w:r>
+        <w:t xml:space="preserve">Dokument pokriva Windows klient, CI/CD, hbbs/hbbr, omrežje, varnost in operativne postopke. Ne predstavlja pogodbenega SLA.</w:t>
+      </w:r>
+    </w:p>
+    <w:p>
+      <w:pPr>
+        <w:pStyle w:val="Heading1"/>
+      </w:pPr>
+      <w:r>
+        <w:t xml:space="preserve">15. Funkcionalne in nefunkcionalne zahteve</w:t>
+      </w:r>
+    </w:p>
+    <w:p>
+      <w:pPr>
+        <w:pStyle w:val="ListBullet"/>
+      </w:pPr>
+      <w:r>
+        <w:t xml:space="preserve">Registracija na connect.inforia.si z vgrajenim javnim ključem strežnika.</w:t>
+      </w:r>
+    </w:p>
+    <w:p>
+      <w:pPr>
+        <w:pStyle w:val="ListBullet"/>
+      </w:pPr>
+      <w:r>
+        <w:t xml:space="preserve">P2P in relay povezave, več zaslonov ter blagovna znamka InforiaConnect (#428bca).</w:t>
+      </w:r>
+    </w:p>
+    <w:p>
+      <w:pPr>
+        <w:pStyle w:val="ListBullet"/>
+      </w:pPr>
+      <w:r>
+        <w:t xml:space="preserve">Ključi in baza preživijo zamenjavo containerjev; produkcijski artifact izdela GitHub Actions.</w:t>
+      </w:r>
+    </w:p>
+    <w:p>
+      <w:pPr>
+        <w:pStyle w:val="Heading1"/>
+      </w:pPr>
+      <w:r>
+        <w:t xml:space="preserve">16. Upravljanje blokiranih ID-jev</w:t>
+      </w:r>
+    </w:p>
+    <w:p>
+      <w:r>
+        <w:t xml:space="preserve">Razširjeni hbbs bere /home/inforiaadmin/rustdesk/blocked_ids.txt in spremembe nalaga samodejno.</w:t>
+      </w:r>
+    </w:p>
+    <w:p>
+      <w:pPr>
+        <w:pStyle w:val="NoSpacing"/>
+      </w:pPr>
+      <w:r>
+        <w:t xml:space="preserve">sudo /pot/do/block-id.sh 248136051</w:t>
+      </w:r>
+    </w:p>
+    <w:p>
+      <w:pPr>
+        <w:pStyle w:val="NoSpacing"/>
+      </w:pPr>
+      <w:r>
+        <w:t xml:space="preserve">sudo /pot/do/list-blocked-ids.sh</w:t>
+      </w:r>
+    </w:p>
+    <w:p>
+      <w:pPr>
+        <w:pStyle w:val="NoSpacing"/>
+      </w:pPr>
+      <w:r>
+        <w:t xml:space="preserve">sudo /pot/do/unblock-id.sh 248136051</w:t>
+      </w:r>
+    </w:p>
+    <w:p>
+      <w:r>
+        <w:t xml:space="preserve">Custom slika je v CI validaciji; do produkcijske namestitve blokiranje na Linux VM še ni aktivno.</w:t>
+      </w:r>
+    </w:p>
+    <w:p>
+      <w:pPr>
+        <w:pStyle w:val="Heading1"/>
+      </w:pPr>
+      <w:r>
+        <w:t xml:space="preserve">17. Namestitev, validacija in rollback</w:t>
+      </w:r>
+    </w:p>
+    <w:p>
+      <w:pPr>
+        <w:pStyle w:val="ListBullet"/>
+      </w:pPr>
+      <w:r>
+        <w:t xml:space="preserve">Predpogoj: uspešen CI, smoke test ter backup /home/inforiaadmin/rustdesk.</w:t>
+      </w:r>
+    </w:p>
+    <w:p>
+      <w:pPr>
+        <w:pStyle w:val="ListBullet"/>
+      </w:pPr>
+      <w:r>
+        <w:t xml:space="preserve">Zamenjaj samo containerja; ohrani host network, restart always in persistent mount.</w:t>
+      </w:r>
+    </w:p>
+    <w:p>
+      <w:pPr>
+        <w:pStyle w:val="ListBullet"/>
+      </w:pPr>
+      <w:r>
+        <w:t xml:space="preserve">Preveri registracijo, P2P, relay, blokado in odblokiranje; rollback uporabi prejšnji image.</w:t>
+      </w:r>
+    </w:p>
+    <w:p>
+      <w:pPr>
+        <w:pStyle w:val="Heading1"/>
+      </w:pPr>
+      <w:r>
+        <w:t xml:space="preserve">18. Varnostne kopije in obnova</w:t>
+      </w:r>
+    </w:p>
+    <w:p>
+      <w:pPr>
+        <w:pStyle w:val="ListBullet"/>
+      </w:pPr>
+      <w:r>
+        <w:t xml:space="preserve">Kopiraj ključa, db_v2.sqlite3, blocked_ids.txt in konfiguracijo.</w:t>
+      </w:r>
+    </w:p>
+    <w:p>
+      <w:pPr>
+        <w:pStyle w:val="ListBullet"/>
+      </w:pPr>
+      <w:r>
+        <w:t xml:space="preserve">Dnevna inkrementalna, tedenska polna in kopija pred nadgradnjo; najmanj 30 dni retencije.</w:t>
+      </w:r>
+    </w:p>
+    <w:p>
+      <w:pPr>
+        <w:pStyle w:val="ListBullet"/>
+      </w:pPr>
+      <w:r>
+        <w:t xml:space="preserve">Zasebni ključ hrani šifrirano in ločeno; obnovo testiraj četrtletno.</w:t>
+      </w:r>
+    </w:p>
+    <w:p>
+      <w:r>
+        <w:t xml:space="preserve">Operativni cilj: RPO 24 ur in RTO 4 ure; to ni pogodbeni SLA.</w:t>
+      </w:r>
+    </w:p>
+    <w:p>
+      <w:pPr>
+        <w:pStyle w:val="Heading1"/>
+      </w:pPr>
+      <w:r>
+        <w:t xml:space="preserve">19. Monitoring, alarmiranje in kapaciteta</w:t>
+      </w:r>
+    </w:p>
+    <w:p>
+      <w:pPr>
+        <w:pStyle w:val="ListBullet"/>
+      </w:pPr>
+      <w:r>
+        <w:t xml:space="preserve">Spremljaj containerje, restarte, disk, CPU/RAM, porte in DNS.</w:t>
+      </w:r>
+    </w:p>
+    <w:p>
+      <w:pPr>
+        <w:pStyle w:val="ListBullet"/>
+      </w:pPr>
+      <w:r>
+        <w:t xml:space="preserve">Opozorilo: disk &lt;20 %, CPU &gt;70 %, RAM &gt;80 %. Kritično: disk &lt;10 %, CPU &gt;90 %, RAM &gt;95 %.</w:t>
+      </w:r>
+    </w:p>
+    <w:p>
+      <w:pPr>
+        <w:pStyle w:val="ListBullet"/>
+      </w:pPr>
+      <w:r>
+        <w:t xml:space="preserve">ID blocklist ne uporablja GPU in ima zanemarljiv vpliv na CPU/RAM.</w:t>
+      </w:r>
+    </w:p>
+    <w:p>
+      <w:pPr>
+        <w:pStyle w:val="Heading1"/>
+      </w:pPr>
+      <w:r>
+        <w:t xml:space="preserve">20. Testni načrt</w:t>
+      </w:r>
+    </w:p>
+    <w:p>
+      <w:pPr>
+        <w:pStyle w:val="ListBullet"/>
+      </w:pPr>
+      <w:r>
+        <w:t xml:space="preserve">Preveri installer, registracijo, zunanji relay, LAN split DNS, blokado, odblokiranje, restart in rollback.</w:t>
+      </w:r>
+    </w:p>
+    <w:p>
+      <w:pPr>
+        <w:pStyle w:val="ListBullet"/>
+      </w:pPr>
+      <w:r>
+        <w:t xml:space="preserve">Odblokiran klient se mora ponovno registrirati v največ 30 sekundah brez izgube ID-ja.</w:t>
+      </w:r>
+    </w:p>
+    <w:p>
+      <w:pPr>
+        <w:pStyle w:val="Heading1"/>
+      </w:pPr>
+      <w:r>
+        <w:t xml:space="preserve">21. Tveganja in omejitve</w:t>
+      </w:r>
+    </w:p>
+    <w:p>
+      <w:pPr>
+        <w:pStyle w:val="ListBullet"/>
+      </w:pPr>
+      <w:r>
+        <w:t xml:space="preserve">Ključ: šifriran backup. Hairpin NAT: split DNS. Image: pripet tag. Porti: monitoring.</w:t>
+      </w:r>
+    </w:p>
+    <w:p>
+      <w:pPr>
+        <w:pStyle w:val="ListBullet"/>
+      </w:pPr>
+      <w:r>
+        <w:t xml:space="preserve">OSS logi niso popoln audit; dolgoročno sta priporočena centralizacija logov in enrollment naprav.</w:t>
+      </w:r>
+    </w:p>
+    <w:p>
+      <w:pPr>
+        <w:pStyle w:val="Heading1"/>
+      </w:pPr>
+      <w:r>
+        <w:t xml:space="preserve">22. Upravljanje sprememb in izdaj</w:t>
+      </w:r>
+    </w:p>
+    <w:p>
+      <w:r>
+        <w:t xml:space="preserve">Pred commitom se zapišejo razlog, datoteke, validacija in čas. Izdaja zahteva uspešen CI, backup, testni načrt in rollback.</w:t>
+      </w:r>
+    </w:p>
+    <w:p>
+      <w:pPr>
+        <w:pStyle w:val="Heading1"/>
+      </w:pPr>
+      <w:r>
+        <w:t xml:space="preserve">23. Vloge in odgovornosti</w:t>
+      </w:r>
+    </w:p>
+    <w:p>
+      <w:pPr>
+        <w:pStyle w:val="ListBullet"/>
+      </w:pPr>
+      <w:r>
+        <w:t xml:space="preserve">Lastnik storitve odobri izdajo; sistemski skrbnik upravlja VM in deployment; vzdrževalec upravlja kodo in CI; podpora prijavlja incidente.</w:t>
+      </w:r>
+    </w:p>
+    <w:p>
+      <w:pPr>
+        <w:pStyle w:val="Heading1"/>
+      </w:pPr>
+      <w:r>
+        <w:t xml:space="preserve">24. Slovar izrazov</w:t>
+      </w:r>
+    </w:p>
+    <w:p>
+      <w:r>
+        <w:t xml:space="preserve">hbbs: ID/rendezvous. hbbr: relay. P2P: direktna povezava. Split DNS: notranji/zunanji odgovor. RPO/RTO: izguba podatkov/čas obnove.</w:t>
+      </w:r>
+    </w:p>
     <w:sectPr>
       <w:footerReference w:type="default" r:id="rId9"/>
       <w:pgSz w:w="12240" w:h="15840"/>

</xml_diff>